<commit_message>
Ch26-30 fix list: table-room geometry, listener rename, thread payoffs
- G1-G7: Otto enters the table room; round table; tableau and timing match ch29
- Ch26 date line, ridge placement (and Ch14), echo/trim fixes
- Ch27 shift change told once (ends on Board's up); evening bell; Gretchen on the screens
- Ch28 cracker tin, control room, listener record, recap trims
- Camilla's box renamed 'the listener' (Kaan keeps 'the ear')
- Ch30: pump-house lift drowned; forty-sevens acknowledged; Elara's routing echo

Co-Authored-By: Claude Opus 5.5 <noreply@anthropic.com>
</commit_message>
<xml_diff>
--- a/claude-notes/manuscript-v2/26-the-wrong-place-merged.docx
+++ b/claude-notes/manuscript-v2/26-the-wrong-place-merged.docx
@@ -50,7 +50,7 @@
           <w:b w:val="0"/>
           <w:i w:val="0"/>
         </w:rPr>
-        <w:t>The morning after the corridor, the tower's overnight digest came in at the fourth bell, as it did every morning: the whole night of the building pressed into a few hundred grey lines that nobody was meant to read to the end.</w:t>
+        <w:t>Eight nights before the table sat, the morning after the corridor, the tower's overnight digest came in at the fourth bell, as it did every morning: the whole night of the building pressed into a few hundred grey lines that nobody was meant to read to the end.</w:t>
       </w:r>
     </w:p>
     <w:p>
@@ -105,7 +105,7 @@
           <w:b w:val="0"/>
           <w:i w:val="0"/>
         </w:rPr>
-        <w:t>He put the pane face down on the blanket. He laid his right hand open on his knee, palm up, and looked at it until it was only a hand. Then he did what he'd done on the Meru railing. He uncurled the fingers one at a time, the little finger last, because it was the one that kept wanting to close. He let his shoulders down. He thought about the drone and its bristle and nothing else, and the warmth along the bone went out of the band, slowly, until the black was as cool as the room.</w:t>
+        <w:t>He put the pane face down on the blanket. He laid his right hand open on his knee, palm up, and looked at it until it was only a hand. Then he did what he'd done on the Meru railing. He uncurled the fingers one at a time, the thumb last, because it was the one that kept wanting to close. He let his shoulders down. He thought about the drone and its bristle and nothing else, and the warmth along the bone went out of the band, slowly, until the black was as cool as the room.</w:t>
       </w:r>
     </w:p>
     <w:p>
@@ -168,7 +168,7 @@
           <w:b w:val="0"/>
           <w:i w:val="0"/>
         </w:rPr>
-        <w:t>He went up the next morning, before anyone could send for him.</w:t>
+        <w:t>He went up the next morning, seven nights out, before anyone could send for him.</w:t>
       </w:r>
     </w:p>
     <w:p>
@@ -177,7 +177,7 @@
           <w:b w:val="0"/>
           <w:i w:val="0"/>
         </w:rPr>
-        <w:t>The summit room was lit for late morning, the lamps tuned to a pale, clean gold that made the cloud below the window look like milk. The Master of the Reserve sat at the side table with his rings already off. They lay in their row on the lacquer, in the dull crescent of scratches they had worn there, each band a seal, each seal a channel, all of them closed. In front of him on a white plate sat a pear, and he was peeling it with a small silver knife in one unbroken strip.</w:t>
+        <w:t>The summit room was lit for late morning, the lamps tuned to a pale, clean gold that made the cloud below the window look like milk. The Master of the Reserve sat at the side table with his rings already off. They lay in their row on the lacquer, in the faint arc of scratches they had worn there, each band a seal, each seal a channel, all of them closed. In front of him on a white plate sat a pear, and he was peeling it with a small silver knife in one unbroken strip.</w:t>
       </w:r>
     </w:p>
     <w:p>
@@ -267,7 +267,7 @@
           <w:b w:val="0"/>
           <w:i w:val="0"/>
         </w:rPr>
-        <w:t>"Ashoka listed the man's effects. A toolbag. A coat. A mechanical counter, which someone thought worth a line. Ashoka's people do not walk into another house's tower without paper. So there was paper. It is not on the list, and you were the only one in that corridor who could still bend down." The peel came free in one long curl and lay on the plate like a dropped ribbon. "It will be ash before the table sits. I told you in the gallery. Put down whatever you are carrying."</w:t>
+        <w:t>"Ashoka listed the man's effects. A toolbag. A coat. A mechanical counter, which someone thought worth a line. Ashoka's people do not walk into another house's tower without paper. So there was paper. It is not on the list, and you were the only one in that corridor who could still bend down." The peel came free in one long curl and lay on the plate like a dropped ribbon. "It will be ash before the table sits. I told you in the gallery corridor. Put down whatever you are carrying."</w:t>
       </w:r>
     </w:p>
     <w:p>
@@ -507,7 +507,7 @@
           <w:b w:val="0"/>
           <w:i w:val="0"/>
         </w:rPr>
-        <w:t xml:space="preserve"> He'd heard a rank in that. It had been a description. Second hand. The tool goes to the apprentice when the old man's grip has had enough of it.</w:t>
+        <w:t xml:space="preserve"> A rank, he'd thought. Second hand. The tool goes to the apprentice when the old man's grip has had enough of it.</w:t>
       </w:r>
     </w:p>
     <w:p>
@@ -516,16 +516,7 @@
           <w:b w:val="0"/>
           <w:i w:val="0"/>
         </w:rPr>
-        <w:t>There was a question behind his teeth he couldn't ask. The band would not close on a hand the city was still holding. It had to be let go of first. So the city had once let go of this man too, stripped him to the bare wrist, and then taken him back and put rings on every finger. Who had done the stripping? Who had done the taking back? And what had the hand done in between?</w:t>
-      </w:r>
-    </w:p>
-    <w:p>
-      <w:r>
-        <w:rPr>
-          <w:b w:val="0"/>
-          <w:i w:val="0"/>
-        </w:rPr>
-        <w:t>He didn't ask. Every question was a reach, and the band listened to reaches. His tongue stayed behind his teeth, and the question stayed with it.</w:t>
+        <w:t>There was a question behind his teeth. The band would not close on a hand the city still held, so the city had once let go of this man too, and then taken him back and put rings on every finger. Who had done the taking back? He didn't ask. His tongue stayed behind his teeth.</w:t>
       </w:r>
     </w:p>
     <w:p>
@@ -579,7 +570,7 @@
           <w:b w:val="0"/>
           <w:i w:val="0"/>
         </w:rPr>
-        <w:t>It came out level, in the voice he'd used to read figures aloud at THRESHOLD, the voice that had once made a director stop behind his chair. One-third of the truth: it would be done, by someone, about something. The rest stayed under his tongue like a coin, and this time the coin was the Master's own.</w:t>
+        <w:t>It came out level, in the voice he'd used to read figures aloud at THRESHOLD, the voice that had once made a director stop behind his chair. One-third of the truth: it would be done, by someone, about something. The rest stayed under his tongue like a coin.</w:t>
       </w:r>
     </w:p>
     <w:p>
@@ -651,7 +642,7 @@
           <w:b w:val="0"/>
           <w:i w:val="0"/>
         </w:rPr>
-        <w:t>On every other train he'd filed that look and walked off with it. He'd been carrying it since the first night of the band without knowing what it weighed.</w:t>
+        <w:t>Since the first carriage he'd filed that look and walked off with it. He'd been carrying it since the first night of the band without knowing what it weighed.</w:t>
       </w:r>
     </w:p>
     <w:p>
@@ -669,7 +660,7 @@
           <w:b w:val="0"/>
           <w:i w:val="0"/>
         </w:rPr>
-        <w:t>He let himself see what it saw. A man standing alone at the dark end of a carriage that the rest of the carriage couldn't feel. Coat buttoned to the throat. Right arm held a little out from the body, the fingers spread, a man with wet hands and nowhere to dry them. And on the wrist something black that drank the carriage lights, and that the man couldn't put down, and had never once tried to see beneath.</w:t>
+        <w:t>He let himself see what it saw. A man standing alone at the dark end of a carriage that the rest of the carriage couldn't feel. Coat buttoned to the throat. Right arm held a little out from the body, the fingers spread, a man with wet hands and nowhere to dry them. And on the wrist something black that drank the carriage lights, and that the man couldn't put down, and had never once let himself picture what lay beneath.</w:t>
       </w:r>
     </w:p>
     <w:p>
@@ -764,7 +755,7 @@
           <w:b w:val="0"/>
           <w:i w:val="0"/>
         </w:rPr>
-        <w:t>He took the notebook out from under the mattress and sat on the bed with it in both hands. The room was the same: one table, one bed, the dark display, the window full of Drona's towers. The incinerator hatch was eleven steps from his door, by the lift. He'd counted once, without meaning to.</w:t>
+        <w:t>He took the notebook out from under the mattress and sat on the bed with it in both hands. The room was the same: one table, one bed, the dark display, the window full of Drona's towers. The incinerator hatch was by the lift. He'd counted the steps once, without meaning to.</w:t>
       </w:r>
     </w:p>
     <w:p>
@@ -886,7 +877,7 @@
           <w:b w:val="0"/>
           <w:i w:val="0"/>
         </w:rPr>
-        <w:t>The notebook pressed against his rib. Somewhere in it, in a small upright hand, was a man who had wanted to know what the instruments wouldn't tell him and had written it down so it would keep. He'd had a name once. Daren didn't know it and never would. But it was written somewhere, on some roll in Ashoka, in someone's memory. Someone ought to say it aloud in a room that was listening.</w:t>
+        <w:t>The notebook pressed against his rib. Somewhere in it, in a small upright hand, was a man who had wanted to know what the instruments wouldn't tell him and had written it down so it would keep. Daren didn't know his name. Somebody in Ashoka did. It was written somewhere, on some roll in Ashoka, in someone's memory. Someone ought to say it aloud in a room that was listening.</w:t>
       </w:r>
     </w:p>
     <w:p>

</xml_diff>

<commit_message>
Ch26 round 2: two bands on the Master's wrist; the refusal's strategy; reveal trimmed; Then header
Co-Authored-By: Claude Opus 5.5 <noreply@anthropic.com>
</commit_message>
<xml_diff>
--- a/claude-notes/manuscript-v2/26-the-wrong-place-merged.docx
+++ b/claude-notes/manuscript-v2/26-the-wrong-place-merged.docx
@@ -43,7 +43,7 @@
           <w:b/>
           <w:color w:val="000000"/>
         </w:rPr>
-        <w:t>Now: The wrong place</w:t>
+        <w:t>Then: The wrong place</w:t>
       </w:r>
     </w:p>
     <w:p>
@@ -244,7 +244,7 @@
           <w:i w:val="0"/>
           <w:strike w:val="0"/>
         </w:rPr>
-        <w:t>Daren stood where he had stood the night of the Annex, on the same square of floor. His right hand hung at his side. He kept it open.</w:t>
+        <w:t>Daren stood where he had stood the night the Annex passed, on the same square of floor. His right hand hung at his side. He kept it open.</w:t>
       </w:r>
     </w:p>
     <w:p>
@@ -390,7 +390,7 @@
           <w:i w:val="0"/>
           <w:strike w:val="0"/>
         </w:rPr>
-        <w:t>It came too fast. It came before Daren had finished the last word, the way the band came before a hand had finished moving, and the old man seemed to hear that too, because his mouth closed on whatever he'd meant to say next. He set the knife down on the plate, crossed it neatly over the peel, and wiped his fingers on a folded cloth.</w:t>
+        <w:t>It came before Daren had finished the last word. The old man heard that too. His mouth closed on whatever he'd meant to say next. He set the knife down on the plate, crossed it neatly over the peel, and wiped his fingers on a folded cloth.</w:t>
       </w:r>
     </w:p>
     <w:p>
@@ -420,17 +420,7 @@
           <w:i w:val="0"/>
           <w:strike w:val="0"/>
         </w:rPr>
-        <w:t>Across it, faded almost to the color of the rest, ran a pale band where nothing had lain in the sun. On its inner edge was a ridge, small and old and flattened by decades.</w:t>
-      </w:r>
-    </w:p>
-    <w:p>
-      <w:r>
-        <w:rPr>
-          <w:b w:val="0"/>
-          <w:i w:val="0"/>
-          <w:strike w:val="0"/>
-        </w:rPr>
-        <w:t>Kubera's gold left a mark on every officer who wore it. He told himself that first. Then he saw where the ridge lay. Gold rode low, against the heel of the hand; that was where his own old ridge was. This one sat a finger higher. It sat where the obsidian sat.</w:t>
+        <w:t>Across it, faded almost to the color of the rest, ran two pale bands. The lower one he knew: Kubera's gold, its ridge low against the heel of the hand, where his own had been. He told himself that first. Then he saw the other. It sat a finger higher. It sat where the obsidian sat.</w:t>
       </w:r>
     </w:p>
     <w:p>
@@ -470,7 +460,7 @@
           <w:i w:val="0"/>
           <w:strike w:val="0"/>
         </w:rPr>
-        <w:t>He had heard them before, in this room, with the obsidian just closed on him and his skin drawn tight from the cold of it. He'd taken them then for a kindness, a small one, the only one offered. He heard them now for what they had been. A man doesn't know how cold a thing is the first night from reading about it. He knows because he has lain awake under it himself, turning his wrist to the window, waiting for the cold to stop.</w:t>
+        <w:t>He had heard them before, in this room, with the obsidian just closed on him and his skin drawn tight from the cold of it. He'd taken them then for a kindness, the only one offered. They had been a memory.</w:t>
       </w:r>
     </w:p>
     <w:p>
@@ -480,23 +470,7 @@
           <w:i w:val="0"/>
           <w:strike w:val="0"/>
         </w:rPr>
-        <w:t xml:space="preserve">He'd known. The ledger, the lamps, the bottle crossing the room at walking pace. </w:t>
-      </w:r>
-      <w:r>
-        <w:rPr>
-          <w:b w:val="0"/>
-          <w:i/>
-          <w:strike w:val="0"/>
-        </w:rPr>
-        <w:t>Learn it slowly. It will learn you faster.</w:t>
-      </w:r>
-      <w:r>
-        <w:rPr>
-          <w:b w:val="0"/>
-          <w:i w:val="0"/>
-          <w:strike w:val="0"/>
-        </w:rPr>
-        <w:t xml:space="preserve"> The corridor. All of it, he'd known.</w:t>
+        <w:t>He'd known.</w:t>
       </w:r>
     </w:p>
     <w:p>
@@ -536,7 +510,7 @@
           <w:i w:val="0"/>
           <w:strike w:val="0"/>
         </w:rPr>
-        <w:t>Daren looked down at his own feet on the square of floor, and then up at the old man, and understood that the gallery corridor had held two meanings and he'd heard only the one that let him go on.</w:t>
+        <w:t>Daren looked down at his own feet on the square of floor, and then up at the old man. The gallery corridor had held two meanings, and he'd heard only the one that let him go on.</w:t>
       </w:r>
     </w:p>
     <w:p>
@@ -546,7 +520,7 @@
           <w:i/>
           <w:strike w:val="0"/>
         </w:rPr>
-        <w:t>So the Grandmaster didn't know what it cost to wear.</w:t>
+        <w:t>He had never asked what the band cost the man who wore it.</w:t>
       </w:r>
       <w:r>
         <w:rPr>
@@ -554,7 +528,7 @@
           <w:i w:val="0"/>
           <w:strike w:val="0"/>
         </w:rPr>
-        <w:t xml:space="preserve"> He'd thought that under a buzzing lamp, and it had been almost a comfort. A careless master was something a man could forgive, or outlast. This one had known the cost to the ounce, carried it, set it down, and then fastened it on someone else.</w:t>
+        <w:t xml:space="preserve"> He'd thought that under a buzzing lamp, and it had been almost a comfort. This man had known the price, paid it, and fastened it on someone else anyway.</w:t>
       </w:r>
     </w:p>
     <w:p>
@@ -582,7 +556,7 @@
           <w:i w:val="0"/>
           <w:strike w:val="0"/>
         </w:rPr>
-        <w:t>There was a question behind his teeth. The band would not close on a hand the city still held, so the city had once let go of this man too, and then taken him back and put rings on every finger. Who had done the taking back? He didn't ask. His tongue stayed behind his teeth.</w:t>
+        <w:t>There was a question behind his teeth. The band would not close on a hand the city still held. So the city had let this man go once, and then taken him back and put rings on every finger. Who had done the taking back? He didn't ask.</w:t>
       </w:r>
     </w:p>
     <w:p>
@@ -592,7 +566,7 @@
           <w:i w:val="0"/>
           <w:strike w:val="0"/>
         </w:rPr>
-        <w:t>"The table," he said instead. "She'll want you to go wherever it is. Blind, she said once. Fetched."</w:t>
+        <w:t>"The table," he said instead. "She'll want you to go wherever it is. They fetch you, don't they. Blind."</w:t>
       </w:r>
     </w:p>
     <w:p>
@@ -732,7 +706,7 @@
           <w:i w:val="0"/>
           <w:strike w:val="0"/>
         </w:rPr>
-        <w:t>Since the first carriage he'd filed that look and walked off with it. He'd been carrying it since the first night of the band without knowing what it weighed.</w:t>
+        <w:t>Since the first carriage he'd filed that look and walked off with it. He'd been carrying it ever since without knowing what it weighed.</w:t>
       </w:r>
     </w:p>
     <w:p>
@@ -888,7 +862,7 @@
           <w:i w:val="0"/>
           <w:strike w:val="0"/>
         </w:rPr>
-        <w:t>He opened his coat and put the notebook inside it, in the inner pocket, against his chest. The soft cover took the warmth of him at once. When he breathed in, he could feel the corner of it press a ribbon of pressure along one rib, and he left it there.</w:t>
+        <w:t>He opened his coat and put the notebook inside it, in the inner pocket, against his chest. The soft cover took the warmth of him at once. When he breathed in, the corner of it pressed along one rib, and he left it there.</w:t>
       </w:r>
     </w:p>
     <w:p>
@@ -918,7 +892,7 @@
           <w:i w:val="0"/>
           <w:strike w:val="0"/>
         </w:rPr>
-        <w:t>He didn't open the gate. He didn't query the reader, or the digest, or the ledger behind the digest. He didn't send a note to anyone's queue in anyone's staff's dull phrasing. The two people on the stair stayed two people, unidentified, wherever they were this morning, eating breakfast or arguing or asleep. He gave the band nothing, on purpose, and kept giving it nothing, and found that holding nothing out to it was harder than any door he'd opened with it.</w:t>
+        <w:t>He didn't open the gate. He didn't query the reader, or the digest, or the ledger behind the digest. He didn't send a note to anyone's queue in anyone's staff's dull phrasing. The two people on the stair stayed two people, unidentified, wherever they were this morning, eating breakfast or arguing or asleep. And two dead on Drona's stair a week before the table sat would be the very pattern she had asked them to sit for. He gave the band nothing, on purpose, and kept giving it nothing, and found that holding nothing out to it was harder than any door he'd opened with it.</w:t>
       </w:r>
     </w:p>
     <w:p>
@@ -958,7 +932,7 @@
           <w:i w:val="0"/>
           <w:strike w:val="0"/>
         </w:rPr>
-        <w:t>It was still true. The band hadn't changed and neither had his hand. But this time he stayed and looked at the stopping, the way he'd once looked at a loss curve until it gave up where it broke. His fingers had stopped because when he tried to picture the wrist underneath, pale and ridged and unfinished, there was no one standing behind it. No house. No name. No man he would be without it.</w:t>
+        <w:t>It was still true. The band hadn't changed and neither had his hand. But this time he stayed and looked at the stopping, the way he'd once stared at a loss curve until it showed him where it broke. His fingers had stopped because when he tried to picture the wrist underneath, pale and ridged and unfinished, there was no one standing behind it. No house. No name. No man he would be without it.</w:t>
       </w:r>
     </w:p>
     <w:p>
@@ -1004,7 +978,7 @@
           <w:i w:val="0"/>
           <w:strike w:val="0"/>
         </w:rPr>
-        <w:t>The notebook pressed against his rib. Somewhere in it, in a small upright hand, was a man who had wanted to know what the instruments wouldn't tell him and had written it down so it would keep. Daren didn't know his name. Somebody in Ashoka did. It was written somewhere, on some roll in Ashoka, in someone's memory. Someone ought to say it aloud in a room that was listening.</w:t>
+        <w:t>The notebook pressed against his rib. Somewhere in it, in a small upright hand, was a man who had wanted to know what the instruments wouldn't tell him and had written it down so it would keep. Daren didn't know his name. He could have found it with one reach. He didn't. Somebody in Ashoka did. It would be on some roll there, or in someone's memory. Someone ought to say it aloud in a room that was listening.</w:t>
       </w:r>
     </w:p>
     <w:p>

</xml_diff>

<commit_message>
Ch26 round 3: seven-night clock ending; cuts to Blind, the lamp and the two-dead line
Co-Authored-By: Claude Opus 5.5 <noreply@anthropic.com>
</commit_message>
<xml_diff>
--- a/claude-notes/manuscript-v2/26-the-wrong-place-merged.docx
+++ b/claude-notes/manuscript-v2/26-the-wrong-place-merged.docx
@@ -330,7 +330,7 @@
           <w:i w:val="0"/>
           <w:strike w:val="0"/>
         </w:rPr>
-        <w:t xml:space="preserve"> would cost, or who would pay it. He hadn't needed to. The words lay on the table between them beside the rings, small and exact.</w:t>
+        <w:t xml:space="preserve"> would cost, or who would pay it.</w:t>
       </w:r>
     </w:p>
     <w:p>
@@ -390,7 +390,7 @@
           <w:i w:val="0"/>
           <w:strike w:val="0"/>
         </w:rPr>
-        <w:t>It came before Daren had finished the last word. The old man heard that too. His mouth closed on whatever he'd meant to say next. He set the knife down on the plate, crossed it neatly over the peel, and wiped his fingers on a folded cloth.</w:t>
+        <w:t>The answer came on top of his last word. The old man heard that too. His mouth closed on whatever he'd meant to say next. He set the knife down on the plate, crossed it neatly over the peel, and wiped his fingers on a folded cloth.</w:t>
       </w:r>
     </w:p>
     <w:p>
@@ -510,25 +510,25 @@
           <w:i w:val="0"/>
           <w:strike w:val="0"/>
         </w:rPr>
-        <w:t>Daren looked down at his own feet on the square of floor, and then up at the old man. The gallery corridor had held two meanings, and he'd heard only the one that let him go on.</w:t>
+        <w:t xml:space="preserve">Daren looked down at his own feet on the square of floor. </w:t>
+      </w:r>
+      <w:r>
+        <w:rPr>
+          <w:b w:val="0"/>
+          <w:i/>
+          <w:strike w:val="0"/>
+        </w:rPr>
+        <w:t>You are standing in the wrong place.</w:t>
       </w:r>
     </w:p>
     <w:p>
       <w:r>
         <w:rPr>
           <w:b w:val="0"/>
-          <w:i/>
-          <w:strike w:val="0"/>
-        </w:rPr>
-        <w:t>He had never asked what the band cost the man who wore it.</w:t>
-      </w:r>
-      <w:r>
-        <w:rPr>
-          <w:b w:val="0"/>
           <w:i w:val="0"/>
           <w:strike w:val="0"/>
         </w:rPr>
-        <w:t xml:space="preserve"> He'd thought that under a buzzing lamp, and it had been almost a comfort. This man had known the price, paid it, and fastened it on someone else anyway.</w:t>
+        <w:t>He had never asked what the band cost the man who wore it. He'd assumed it cost him nothing. This man had known the price, paid it, and fastened it on someone else anyway.</w:t>
       </w:r>
     </w:p>
     <w:p>
@@ -566,7 +566,7 @@
           <w:i w:val="0"/>
           <w:strike w:val="0"/>
         </w:rPr>
-        <w:t>"The table," he said instead. "She'll want you to go wherever it is. They fetch you, don't they. Blind."</w:t>
+        <w:t>"The table," he said instead. "She'll want you to go wherever it is."</w:t>
       </w:r>
     </w:p>
     <w:p>
@@ -892,7 +892,7 @@
           <w:i w:val="0"/>
           <w:strike w:val="0"/>
         </w:rPr>
-        <w:t>He didn't open the gate. He didn't query the reader, or the digest, or the ledger behind the digest. He didn't send a note to anyone's queue in anyone's staff's dull phrasing. The two people on the stair stayed two people, unidentified, wherever they were this morning, eating breakfast or arguing or asleep. And two dead on Drona's stair a week before the table sat would be the very pattern she had asked them to sit for. He gave the band nothing, on purpose, and kept giving it nothing, and found that holding nothing out to it was harder than any door he'd opened with it.</w:t>
+        <w:t>He didn't open the gate. He didn't query the reader, or the digest, or the ledger behind the digest. He didn't send a note to anyone's queue in anyone's staff's dull phrasing. The two people on the stair stayed two people, unidentified, wherever they were this morning, eating breakfast or arguing or asleep. He gave the band nothing. His hand wanted to close. He let it want.</w:t>
       </w:r>
     </w:p>
     <w:p>
@@ -932,7 +932,7 @@
           <w:i w:val="0"/>
           <w:strike w:val="0"/>
         </w:rPr>
-        <w:t>It was still true. The band hadn't changed and neither had his hand. But this time he stayed and looked at the stopping, the way he'd once stared at a loss curve until it showed him where it broke. His fingers had stopped because when he tried to picture the wrist underneath, pale and ridged and unfinished, there was no one standing behind it. No house. No name. No man he would be without it.</w:t>
+        <w:t>It was still true. The band hadn't changed and neither had his hand. But this time he stayed and looked at the stopping. His fingers had stopped because when he tried to picture the wrist underneath, pale and ridged and unfinished, there was no one standing behind it. No house. No name. No man he would be without it.</w:t>
       </w:r>
     </w:p>
     <w:p>
@@ -942,7 +942,7 @@
           <w:i w:val="0"/>
           <w:strike w:val="0"/>
         </w:rPr>
-        <w:t xml:space="preserve">The Master had stood here once, with the same fingers under the same edge. He'd stopped too. Then, one day, he hadn't. And what he'd become afterwards had a row of rings and a pear and a silver knife, and a plain way of saying </w:t>
+        <w:t xml:space="preserve">The Master had once had the same fingers under the same edge. He'd stopped too. Then, one day, he hadn't. And what he'd become afterwards had a row of rings and a pear and a silver knife, and a plain way of saying </w:t>
       </w:r>
       <w:r>
         <w:rPr>
@@ -988,17 +988,7 @@
           <w:i w:val="0"/>
           <w:strike w:val="0"/>
         </w:rPr>
-        <w:t>He turned the thought over and found it had a person in it.</w:t>
-      </w:r>
-    </w:p>
-    <w:p>
-      <w:r>
-        <w:rPr>
-          <w:b w:val="0"/>
-          <w:i w:val="0"/>
-          <w:strike w:val="0"/>
-        </w:rPr>
-        <w:t>Maybe there was someone underneath after all. He didn't know who. He sat on the narrow bed with his right hand open on his knee and the man's paper against his ribs, and didn't move, and waited to find out.</w:t>
+        <w:t>Maybe there was someone underneath after all. He sat on the narrow bed with his right hand open on his knee and the man's paper against his ribs. Seven nights. The Master would be counting them too.</w:t>
       </w:r>
     </w:p>
     <w:sectPr>

</xml_diff>